<commit_message>
Add hardware network and power guides and update project overviews
</commit_message>
<xml_diff>
--- a/00_overview/总项目介绍_简要版.docx
+++ b/00_overview/总项目介绍_简要版.docx
@@ -12,7 +12,22 @@
     </w:p>
     <w:p>
       <w:r>
+        <w:t>两台主机均为单千兆网口 J1900：Debian 主机配 8 GB DDR3、64 GB mSATA SSD，使用 19 V 独立电源；OpenWrt 主机配 2 GB DDR3、32 GB mSATA SSD，使用 12 V 电源。中兴 E8822 电信定制版负责校园接入，OpenWrt 采用旁路由方案。TL-SG1008M 用于扩展端口，主路由接口够用时可省去。</w:t>
+      </w:r>
+    </w:p>
+    <w:p>
+      <w:r>
+        <w:t>主机相关支出 245 元，路由器、交换机和 4 根网线共 56.2 元，已知费用合计 301.2 元。12 V 可调电源为主路由和 OpenWrt 主机供电，交换机通过 12 V 转 9 V 模块供电；供电配件价格另计。</w:t>
+      </w:r>
+    </w:p>
+    <w:p>
+      <w:r>
         <w:t>主要问题集中在地址冲突、网段重叠、代理链、DNS、字符编码和 AI 协议差异。通过规划 DHCP、精确路由、独立桥接、按协议适配和回归测试逐步解决。项目整理为三个分项教程、对应 Prompt、总 Prompt 和源码，方便以后按参数复现。</w:t>
+      </w:r>
+    </w:p>
+    <w:p>
+      <w:r>
+        <w:t>设备采购、接线和供电另有土豆的服务器和软路由简要版与详细版，作为三个部署教程的基础资料。</w:t>
       </w:r>
     </w:p>
     <w:sectPr>

</xml_diff>